<commit_message>
docs: thesis — fill in student name and banner ID on cover page
Co-Authored-By: Claude Sonnet 5 <noreply@anthropic.com>
</commit_message>
<xml_diff>
--- a/docs/thesis/FYP_Report.docx
+++ b/docs/thesis/FYP_Report.docx
@@ -22,7 +22,7 @@
         <w:rPr>
           <w:b/>
         </w:rPr>
-        <w:t>[Student Name — fill in]</w:t>
+        <w:t>Ibtissam Merzouqi</w:t>
       </w:r>
     </w:p>
     <w:p>
@@ -33,7 +33,7 @@
         <w:rPr>
           <w:b/>
         </w:rPr>
-        <w:t>[Banner ID — fill in]</w:t>
+        <w:t>001487042</w:t>
       </w:r>
     </w:p>
     <w:p>

</xml_diff>

<commit_message>
docs(thesis): fix Figure 4.4 splice — image marker had trailing paragraph text, breaking embedding
Co-Authored-By: Claude Fable 5 <noreply@anthropic.com>
Claude-Session: https://claude.ai/code/session_01VJ36XkFuVMqz7qJ92oDpCg
</commit_message>
<xml_diff>
--- a/docs/thesis/FYP_Report.docx
+++ b/docs/thesis/FYP_Report.docx
@@ -7385,10 +7385,61 @@
     </w:p>
     <w:p>
       <w:pPr>
+        <w:jc w:val="center"/>
+      </w:pPr>
+      <w:r>
+        <w:drawing>
+          <wp:inline xmlns:a="http://schemas.openxmlformats.org/drawingml/2006/main" xmlns:pic="http://schemas.openxmlformats.org/drawingml/2006/picture">
+            <wp:extent cx="5669280" cy="3543300"/>
+            <wp:docPr id="6" name="Picture 6"/>
+            <wp:cNvGraphicFramePr>
+              <a:graphicFrameLocks noChangeAspect="1"/>
+            </wp:cNvGraphicFramePr>
+            <a:graphic>
+              <a:graphicData uri="http://schemas.openxmlformats.org/drawingml/2006/picture">
+                <pic:pic>
+                  <pic:nvPicPr>
+                    <pic:cNvPr id="0" name="app_screenshot_synthetic.png"/>
+                    <pic:cNvPicPr/>
+                  </pic:nvPicPr>
+                  <pic:blipFill>
+                    <a:blip r:embed="rId14"/>
+                    <a:stretch>
+                      <a:fillRect/>
+                    </a:stretch>
+                  </pic:blipFill>
+                  <pic:spPr>
+                    <a:xfrm>
+                      <a:off x="0" y="0"/>
+                      <a:ext cx="5669280" cy="3543300"/>
+                    </a:xfrm>
+                    <a:prstGeom prst="rect"/>
+                  </pic:spPr>
+                </pic:pic>
+              </a:graphicData>
+            </a:graphic>
+          </wp:inline>
+        </w:drawing>
+      </w:r>
+    </w:p>
+    <w:p>
+      <w:pPr>
+        <w:jc w:val="center"/>
+      </w:pPr>
+      <w:r>
+        <w:rPr>
+          <w:i/>
+          <w:sz w:val="18"/>
+        </w:rPr>
+        <w:t>Figure 4.4 — The live application handling the no-face condition gracefully (synthetic test-pattern camera; screenshots of real-face sessions use DAiSEE-derived fixtures whose licence forbids committing frames, so the live-face view is shown at the demonstration instead). Source: docs/results/app_screenshot_synthetic.png.</w:t>
+      </w:r>
+    </w:p>
+    <w:p>
+      <w:pPr>
         <w:spacing w:after="160"/>
       </w:pPr>
       <w:r>
-        <w:t>![Figure 4.4 — The live application handling the no-face condition gracefully (synthetic test-pattern camera; screenshots of real-face sessions use DAiSEE-derived fixtures whose licence forbids committing frames, so the live-face view is shown at the demonstration instead). Source: docs/results/app_screenshot_synthetic.png.](docs/results/app_screenshot_synthetic.png) Two faces simultaneously in frame (a synthetic side-by-side composite of two DAiSEE clips was required for this specific test, since the one naturally two-person DAiSEE clip examined never has its second person facing the camera) were both detected, with the primary-selection logic correctly choosing the larger/closer face and the on-screen overlay rendering the second face's landmarks visibly dimmed relative to the primary's, confirmed at 2× zoom. Moderate lighting reduction still produced a valid detection; severe lighting reduction produced a clean no-detection result rather than a degraded, potentially-misleading partial one. A subject wearing glasses throughout was detected with the full 478 landmarks, including populated iris/gaze features, in the lighting conditions tested.</w:t>
+        <w:t>Two faces simultaneously in frame (a synthetic side-by-side composite of two DAiSEE clips was required for this specific test, since the one naturally two-person DAiSEE clip examined never has its second person facing the camera) were both detected, with the primary-selection logic correctly choosing the larger/closer face and the on-screen overlay rendering the second face's landmarks visibly dimmed relative to the primary's, confirmed at 2× zoom. Moderate lighting reduction still produced a valid detection; severe lighting reduction produced a clean no-detection result rather than a degraded, potentially-misleading partial one. A subject wearing glasses throughout was detected with the full 478 landmarks, including populated iris/gaze features, in the lighting conditions tested.</w:t>
       </w:r>
     </w:p>
     <w:p>

</xml_diff>

<commit_message>
docs(thesis): Word-ready captions + submission date
Figure and table captions now use Word's Caption paragraph style, so
References -> Insert Table of Figures generates the List of Figures and
List of Tables automatically (previously plain italic text Word could not
index). Submission date filled (3 September 2026, per the confirmed viva
date). TOC/LoF placeholder notes simplified to one-click Word
instructions.

Co-Authored-By: Claude Fable 5 <noreply@anthropic.com>
Claude-Session: https://claude.ai/code/session_01VJ36XkFuVMqz7qJ92oDpCg
</commit_message>
<xml_diff>
--- a/docs/thesis/FYP_Report.docx
+++ b/docs/thesis/FYP_Report.docx
@@ -75,7 +75,7 @@
         <w:rPr>
           <w:b/>
         </w:rPr>
-        <w:t>[Submission date — fill in]</w:t>
+        <w:t>3 September 2026</w:t>
       </w:r>
     </w:p>
     <w:p>
@@ -202,7 +202,7 @@
           <w:i/>
           <w:color w:val="606060"/>
         </w:rPr>
-        <w:t>[Auto-generate from headings in Word/Word Online after pasting: References → Table of Contents. Structure below.]</w:t>
+        <w:t>[Word: References → Table of Contents — all headings are proper Word heading styles, so this generates in one click. Delete this line after.]</w:t>
       </w:r>
     </w:p>
     <w:p>
@@ -280,7 +280,7 @@
           <w:i/>
           <w:color w:val="606060"/>
         </w:rPr>
-        <w:t>[Populate via Word's "Insert Caption" + "Insert Table of Figures" once tables/figures below are placed in the final document. Source data/images for each are cited inline in the relevant section — see `docs/results/`, `docs/verification/`, `docs/architecture.md`.]</w:t>
+        <w:t>[Word: References → Insert Table of Figures (Caption label: "Figure", then repeat for "Table") — every figure and table caption is a proper Word Caption paragraph, so both lists generate automatically. Delete this line after.]</w:t>
       </w:r>
     </w:p>
     <w:p>
@@ -1129,11 +1129,11 @@
     </w:p>
     <w:p>
       <w:pPr>
+        <w:pStyle w:val="Caption"/>
         <w:jc w:val="center"/>
       </w:pPr>
       <w:r>
         <w:rPr>
-          <w:i/>
           <w:sz w:val="18"/>
         </w:rPr>
         <w:t>Figure 1.1 — Engagement-class distribution per official DAiSEE split. Source: docs/results/class_dist.png (generated by ml/scripts/plot_class_dist.py).</w:t>
@@ -2724,11 +2724,11 @@
     </w:p>
     <w:p>
       <w:pPr>
+        <w:pStyle w:val="Caption"/>
         <w:jc w:val="center"/>
       </w:pPr>
       <w:r>
         <w:rPr>
-          <w:i/>
           <w:sz w:val="18"/>
         </w:rPr>
         <w:t>Figure 3.1 — Contract landmark indices rendered per group on a real detected face (verification subject: public-domain official White House portrait of Barack Obama, Pete Souza, 2012). Source: docs/verification/landmarks_zoom.png.</w:t>
@@ -3742,7 +3742,7 @@
     </w:p>
     <w:p>
       <w:pPr>
-        <w:spacing w:after="160"/>
+        <w:pStyle w:val="Caption"/>
       </w:pPr>
       <w:r>
         <w:t xml:space="preserve">Table 4.1 — Per-feature Python↔browser absolute differences over the 100-frame parity fixture, after the Amendment 4 fix (source: </w:t>
@@ -4444,7 +4444,7 @@
     </w:p>
     <w:p>
       <w:pPr>
-        <w:spacing w:after="160"/>
+        <w:pStyle w:val="Caption"/>
       </w:pPr>
       <w:r>
         <w:t xml:space="preserve">Table 4.2 — Classical baselines on both held-out splits (source: </w:t>
@@ -5051,11 +5051,11 @@
     </w:p>
     <w:p>
       <w:pPr>
+        <w:pStyle w:val="Caption"/>
         <w:jc w:val="center"/>
       </w:pPr>
       <w:r>
         <w:rPr>
-          <w:i/>
           <w:sz w:val="18"/>
         </w:rPr>
         <w:t>Figure 4.1 — Training loss and validation metrics per epoch for the shipped checkpoint's run (best epoch 4, validation macro-F1 0.3043). Source data committed as docs/results/training_curves_shipped.csv.</w:t>
@@ -5256,7 +5256,7 @@
     </w:p>
     <w:p>
       <w:pPr>
-        <w:spacing w:after="160"/>
+        <w:pStyle w:val="Caption"/>
       </w:pPr>
       <w:r>
         <w:t xml:space="preserve">Table 4.3 — Per-class Test-split metrics, fp32 (source: </w:t>
@@ -5831,11 +5831,11 @@
     </w:p>
     <w:p>
       <w:pPr>
+        <w:pStyle w:val="Caption"/>
         <w:jc w:val="center"/>
       </w:pPr>
       <w:r>
         <w:rPr>
-          <w:i/>
           <w:sz w:val="18"/>
         </w:rPr>
         <w:t>Figure 4.2 — Test-split confusion matrices, raw counts and row-normalised. Source: docs/results/confusion_test.png.</w:t>
@@ -5882,11 +5882,11 @@
     </w:p>
     <w:p>
       <w:pPr>
+        <w:pStyle w:val="Caption"/>
         <w:jc w:val="center"/>
       </w:pPr>
       <w:r>
         <w:rPr>
-          <w:i/>
           <w:sz w:val="18"/>
         </w:rPr>
         <w:t>Figure 4.3 — One-vs-rest ROC curves on the Test split. Source: docs/results/roc_test.png.</w:t>
@@ -6899,7 +6899,7 @@
     </w:p>
     <w:p>
       <w:pPr>
-        <w:spacing w:after="160"/>
+        <w:pStyle w:val="Caption"/>
       </w:pPr>
       <w:r>
         <w:t xml:space="preserve">Table 4.4 — In-browser inference benchmark, development machine (source: </w:t>
@@ -7424,11 +7424,11 @@
     </w:p>
     <w:p>
       <w:pPr>
+        <w:pStyle w:val="Caption"/>
         <w:jc w:val="center"/>
       </w:pPr>
       <w:r>
         <w:rPr>
-          <w:i/>
           <w:sz w:val="18"/>
         </w:rPr>
         <w:t>Figure 4.4 — The live application handling the no-face condition gracefully (synthetic test-pattern camera; screenshots of real-face sessions use DAiSEE-derived fixtures whose licence forbids committing frames, so the live-face view is shown at the demonstration instead). Source: docs/results/app_screenshot_synthetic.png.</w:t>
@@ -7546,7 +7546,7 @@
     </w:p>
     <w:p>
       <w:pPr>
-        <w:spacing w:after="160"/>
+        <w:pStyle w:val="Caption"/>
       </w:pPr>
       <w:r>
         <w:t xml:space="preserve">Table 4.5 — Architecture comparison at matched hyperparameters, Validation split, mean macro-F1 ± std over three seeds (source: </w:t>
@@ -7851,7 +7851,7 @@
     <w:p/>
     <w:p>
       <w:pPr>
-        <w:spacing w:after="160"/>
+        <w:pStyle w:val="Caption"/>
       </w:pPr>
       <w:r>
         <w:t xml:space="preserve">Table 4.6 — Clip-level bootstrap significance tests, TCN vs. gradient boosting, 2,000 iterations resampling clip IDs (source: </w:t>
@@ -8217,7 +8217,7 @@
     </w:p>
     <w:p>
       <w:pPr>
-        <w:spacing w:after="160"/>
+        <w:pStyle w:val="Caption"/>
       </w:pPr>
       <w:r>
         <w:t xml:space="preserve">Table 4.7 — The search that validated the shipped model: each avenue, its result, and its evidence file (full record: </w:t>
@@ -8591,7 +8591,7 @@
     <w:p/>
     <w:p>
       <w:pPr>
-        <w:spacing w:after="160"/>
+        <w:pStyle w:val="Caption"/>
       </w:pPr>
       <w:r>
         <w:t xml:space="preserve">Table 4.8 — Evaluation reframing: the same predictions scored at the benchmark's clip granularity, with and without the Validation-calibrated decision thresholds (sources: </w:t>

</xml_diff>

<commit_message>
chore: clean project identity and tracking docs
</commit_message>
<xml_diff>
--- a/docs/thesis/FYP_Report.docx
+++ b/docs/thesis/FYP_Report.docx
@@ -95,115 +95,7 @@
           <w:i/>
           <w:color w:val="606060"/>
         </w:rPr>
-        <w:t xml:space="preserve">This report is written from the completed </w:t>
-      </w:r>
-      <w:r>
-        <w:rPr>
-          <w:rFonts w:ascii="Consolas" w:hAnsi="Consolas"/>
-          <w:b w:val="0"/>
-          <w:i/>
-          <w:color w:val="606060"/>
-          <w:sz w:val="20"/>
-        </w:rPr>
-        <w:t>Multimodal-Cognitive-Overload-Detection</w:t>
-      </w:r>
-      <w:r>
-        <w:rPr>
-          <w:b w:val="0"/>
-          <w:i/>
-          <w:color w:val="606060"/>
-        </w:rPr>
-        <w:t xml:space="preserve"> repository and its full development record (</w:t>
-      </w:r>
-      <w:r>
-        <w:rPr>
-          <w:rFonts w:ascii="Consolas" w:hAnsi="Consolas"/>
-          <w:b w:val="0"/>
-          <w:i/>
-          <w:color w:val="606060"/>
-          <w:sz w:val="20"/>
-        </w:rPr>
-        <w:t>docs/PROGRESS.md</w:t>
-      </w:r>
-      <w:r>
-        <w:rPr>
-          <w:b w:val="0"/>
-          <w:i/>
-          <w:color w:val="606060"/>
-        </w:rPr>
-        <w:t xml:space="preserve">, </w:t>
-      </w:r>
-      <w:r>
-        <w:rPr>
-          <w:rFonts w:ascii="Consolas" w:hAnsi="Consolas"/>
-          <w:b w:val="0"/>
-          <w:i/>
-          <w:color w:val="606060"/>
-          <w:sz w:val="20"/>
-        </w:rPr>
-        <w:t>CONTRACT.md</w:t>
-      </w:r>
-      <w:r>
-        <w:rPr>
-          <w:b w:val="0"/>
-          <w:i/>
-          <w:color w:val="606060"/>
-        </w:rPr>
-        <w:t xml:space="preserve">, </w:t>
-      </w:r>
-      <w:r>
-        <w:rPr>
-          <w:rFonts w:ascii="Consolas" w:hAnsi="Consolas"/>
-          <w:b w:val="0"/>
-          <w:i/>
-          <w:color w:val="606060"/>
-          <w:sz w:val="20"/>
-        </w:rPr>
-        <w:t>BUILD_PLAN_1.md</w:t>
-      </w:r>
-      <w:r>
-        <w:rPr>
-          <w:b w:val="0"/>
-          <w:i/>
-          <w:color w:val="606060"/>
-        </w:rPr>
-        <w:t xml:space="preserve">, </w:t>
-      </w:r>
-      <w:r>
-        <w:rPr>
-          <w:rFonts w:ascii="Consolas" w:hAnsi="Consolas"/>
-          <w:b w:val="0"/>
-          <w:i/>
-          <w:color w:val="606060"/>
-          <w:sz w:val="20"/>
-        </w:rPr>
-        <w:t>GAP_CLOSURE_PLAN.md</w:t>
-      </w:r>
-      <w:r>
-        <w:rPr>
-          <w:b w:val="0"/>
-          <w:i/>
-          <w:color w:val="606060"/>
-        </w:rPr>
-        <w:t xml:space="preserve">, </w:t>
-      </w:r>
-      <w:r>
-        <w:rPr>
-          <w:rFonts w:ascii="Consolas" w:hAnsi="Consolas"/>
-          <w:b w:val="0"/>
-          <w:i/>
-          <w:color w:val="606060"/>
-          <w:sz w:val="20"/>
-        </w:rPr>
-        <w:t>PROJECT_COMPLETION_PLAN.md</w:t>
-      </w:r>
-      <w:r>
-        <w:rPr>
-          <w:b w:val="0"/>
-          <w:i/>
-          <w:color w:val="606060"/>
-        </w:rPr>
-        <w:t>). All figures, tables, and code references are drawn directly from artefacts produced and version-controlled in that repository (each figure's source data file is named in its caption); none are illustrative or hypothetical.</w:t>
+        <w:t>This report is written from the completed project repository and its version-controlled implementation, contract, evaluation artefacts, and verification documentation. All figures, tables, and code references are drawn directly from artefacts produced by the project (each figure's source data file is named in its caption); none are illustrative or hypothetical.</w:t>
       </w:r>
     </w:p>
     <w:p>
@@ -298,7 +190,7 @@
           <w:b w:val="0"/>
           <w:i w:val="0"/>
         </w:rPr>
-        <w:t xml:space="preserve">This project was built in two tracks against a frozen interface contract, and I thank my Track B collaborator for holding that contract to the letter over twenty days of parallel development; the cross-language parity gate described in Chapter 4 only has value because both sides refused to change the specification quietly. I also thank the authors of the DAiSEE dataset (Gupta </w:t>
+        <w:t xml:space="preserve">This project was built in two technical tracks against a frozen interface contract; the cross-language parity gate described in Chapter 4 ensured that the Python and TypeScript implementations remained aligned. I also thank the authors of the DAiSEE dataset (Gupta </w:t>
       </w:r>
       <w:r>
         <w:rPr>
@@ -349,7 +241,7 @@
           <w:b w:val="0"/>
           <w:i w:val="0"/>
         </w:rPr>
-        <w:t>Generative AI tools (Anthropic's Claude, used through the Claude Code development environment) were used during this project as a development and drafting assistant: for writing and refactoring portions of the project's source code and automated tests, for running and logging the experiment pipelines described in Chapter 4, and for drafting prose in this report which was then reviewed by the author. All experimental results reported here were produced by executing the project's committed code against the real DAiSEE dataset and are reproducible from the repository; no result, figure, or reference was generated by an AI system without execution. The project's design decisions, the interface contract with the Track B partner, and responsibility for the final content of this report remain the author's.</w:t>
+        <w:t>Generative AI tools (Anthropic's Claude, used through the Claude Code development environment) were used during this project as a development and drafting assistant: for writing and refactoring portions of the project's source code and automated tests, for running and logging the experiment pipelines described in Chapter 4, and for drafting prose in this report which was then reviewed by the author. All experimental results reported here were produced by executing the project's committed code against the real DAiSEE dataset and are reproducible from the repository; no result, figure, or reference was generated by an AI system without execution. The project's design decisions and responsibility for the final content of this report remain the author's.</w:t>
       </w:r>
     </w:p>
     <w:p>
@@ -1140,55 +1032,7 @@
           <w:b w:val="0"/>
           <w:i w:val="0"/>
         </w:rPr>
-        <w:t>Specific, measurable, achievable, relevant, time-bound (S.M.A.R.T.) objectives, as executed against a 20-day build plan (</w:t>
-      </w:r>
-      <w:r>
-        <w:rPr>
-          <w:rFonts w:ascii="Consolas" w:hAnsi="Consolas"/>
-          <w:b w:val="0"/>
-          <w:i w:val="0"/>
-          <w:sz w:val="20"/>
-        </w:rPr>
-        <w:t>BUILD_PLAN_1.md</w:t>
-      </w:r>
-      <w:r>
-        <w:rPr>
-          <w:b w:val="0"/>
-          <w:i w:val="0"/>
-        </w:rPr>
-        <w:t>) and a subsequent verification/hardening pass (</w:t>
-      </w:r>
-      <w:r>
-        <w:rPr>
-          <w:rFonts w:ascii="Consolas" w:hAnsi="Consolas"/>
-          <w:b w:val="0"/>
-          <w:i w:val="0"/>
-          <w:sz w:val="20"/>
-        </w:rPr>
-        <w:t>GAP_CLOSURE_PLAN.md</w:t>
-      </w:r>
-      <w:r>
-        <w:rPr>
-          <w:b w:val="0"/>
-          <w:i w:val="0"/>
-        </w:rPr>
-        <w:t xml:space="preserve">, </w:t>
-      </w:r>
-      <w:r>
-        <w:rPr>
-          <w:rFonts w:ascii="Consolas" w:hAnsi="Consolas"/>
-          <w:b w:val="0"/>
-          <w:i w:val="0"/>
-          <w:sz w:val="20"/>
-        </w:rPr>
-        <w:t>PROJECT_COMPLETION_PLAN.md</w:t>
-      </w:r>
-      <w:r>
-        <w:rPr>
-          <w:b w:val="0"/>
-          <w:i w:val="0"/>
-        </w:rPr>
-        <w:t>):</w:t>
+        <w:t>Specific, measurable, achievable, relevant, time-bound (S.M.A.R.T.) objectives, as executed during the initial build and subsequent verification/hardening passes:</w:t>
       </w:r>
     </w:p>
     <w:p>
@@ -3062,7 +2906,7 @@
           <w:b w:val="0"/>
           <w:i w:val="0"/>
         </w:rPr>
-        <w:t xml:space="preserve">The project's own name for its methodology, used consistently throughout its own build documentation, is </w:t>
+        <w:t xml:space="preserve">The project's methodology is </w:t>
       </w:r>
       <w:r>
         <w:rPr>
@@ -3076,7 +2920,7 @@
           <w:b w:val="0"/>
           <w:i w:val="0"/>
         </w:rPr>
-        <w:t>: rather than a single linear pipeline, two independently developed tracks — a Python training pipeline ("Track A") and a TypeScript browser-inference pipeline ("Track B") — are built in parallel against a single frozen specification document (</w:t>
+        <w:t>: rather than a single linear pipeline, two technical tracks — a Python training pipeline ("Track A") and a TypeScript browser-inference pipeline ("Track B") — are built against a single frozen specification document (</w:t>
       </w:r>
       <w:r>
         <w:rPr>
@@ -3092,23 +2936,7 @@
           <w:b w:val="0"/>
           <w:i w:val="0"/>
         </w:rPr>
-        <w:t>), with an automated numerical-equivalence test (R1) as the mechanism that lets both tracks proceed without waiting on each other while still guaranteeing they end up compatible. This is closer to a contract-first API-development pattern borrowed from software engineering than to a conventional single-track ML pipeline, and it is the direct methodological answer to the train/serve-skew risk named as the highest-likelihood risk in this project's own risk register (</w:t>
-      </w:r>
-      <w:r>
-        <w:rPr>
-          <w:rFonts w:ascii="Consolas" w:hAnsi="Consolas"/>
-          <w:b w:val="0"/>
-          <w:i w:val="0"/>
-          <w:sz w:val="20"/>
-        </w:rPr>
-        <w:t>BUILD_PLAN_1.md</w:t>
-      </w:r>
-      <w:r>
-        <w:rPr>
-          <w:b w:val="0"/>
-          <w:i w:val="0"/>
-        </w:rPr>
-        <w:t xml:space="preserve"> §8).</w:t>
+        <w:t>), with an automated numerical-equivalence test (R1) as the mechanism that keeps both implementations compatible. This is closer to a contract-first API-development pattern borrowed from software engineering than to a conventional single-track ML pipeline, and it is the direct methodological answer to the train/serve-skew risk identified during the project's design review.</w:t>
       </w:r>
     </w:p>
     <w:p>
@@ -14098,78 +13926,14 @@
           <w:b/>
           <w:i w:val="0"/>
         </w:rPr>
-        <w:t>Appendix F — Development process record.</w:t>
-      </w:r>
-      <w:r>
-        <w:rPr>
-          <w:b w:val="0"/>
-          <w:i w:val="0"/>
-        </w:rPr>
-        <w:t xml:space="preserve"> </w:t>
-      </w:r>
-      <w:r>
-        <w:rPr>
-          <w:rFonts w:ascii="Consolas" w:hAnsi="Consolas"/>
-          <w:b w:val="0"/>
-          <w:i w:val="0"/>
-          <w:sz w:val="20"/>
-        </w:rPr>
-        <w:t>docs/PROGRESS.md</w:t>
-      </w:r>
-      <w:r>
-        <w:rPr>
-          <w:b w:val="0"/>
-          <w:i w:val="0"/>
-        </w:rPr>
-        <w:t xml:space="preserve"> — full day-by-day project history; </w:t>
-      </w:r>
-      <w:r>
-        <w:rPr>
-          <w:rFonts w:ascii="Consolas" w:hAnsi="Consolas"/>
-          <w:b w:val="0"/>
-          <w:i w:val="0"/>
-          <w:sz w:val="20"/>
-        </w:rPr>
-        <w:t>BUILD_PLAN_1.md</w:t>
-      </w:r>
-      <w:r>
-        <w:rPr>
-          <w:b w:val="0"/>
-          <w:i w:val="0"/>
-        </w:rPr>
-        <w:t xml:space="preserve"> — original 20-day build plan with retrospective status annotations; </w:t>
-      </w:r>
-      <w:r>
-        <w:rPr>
-          <w:rFonts w:ascii="Consolas" w:hAnsi="Consolas"/>
-          <w:b w:val="0"/>
-          <w:i w:val="0"/>
-          <w:sz w:val="20"/>
-        </w:rPr>
-        <w:t>GAP_CLOSURE_PLAN.md</w:t>
-      </w:r>
-      <w:r>
-        <w:rPr>
-          <w:b w:val="0"/>
-          <w:i w:val="0"/>
-        </w:rPr>
-        <w:t xml:space="preserve"> — the mid-project self-audit and remediation plan referenced in Section 4.1; </w:t>
-      </w:r>
-      <w:r>
-        <w:rPr>
-          <w:rFonts w:ascii="Consolas" w:hAnsi="Consolas"/>
-          <w:b w:val="0"/>
-          <w:i w:val="0"/>
-          <w:sz w:val="20"/>
-        </w:rPr>
-        <w:t>PROJECT_COMPLETION_PLAN.md</w:t>
-      </w:r>
-      <w:r>
-        <w:rPr>
-          <w:b w:val="0"/>
-          <w:i w:val="0"/>
-        </w:rPr>
-        <w:t xml:space="preserve"> — the phased plan this report's own Experimentation chapter is structured against.</w:t>
+        <w:t>Appendix F — Verification record.</w:t>
+      </w:r>
+      <w:r>
+        <w:rPr>
+          <w:b w:val="0"/>
+          <w:i w:val="0"/>
+        </w:rPr>
+        <w:t xml:space="preserve"> The repository's implementation, contract, evaluation artefacts, privacy evidence, and demo verification documents provide the reproducibility record for this report.</w:t>
       </w:r>
     </w:p>
     <w:p>
@@ -14204,7 +13968,7 @@
           <w:b w:val="0"/>
           <w:i w:val="0"/>
         </w:rPr>
-        <w:t>): https://github.com/MuhammadBilal-00/Multimodal-Cognitive-Overload-Detection.</w:t>
+        <w:t>), accompanies this report.</w:t>
       </w:r>
     </w:p>
     <w:sectPr>

</xml_diff>